<commit_message>
Update 3. Biologie Klausur 17.04.2026 (WIP).docx
</commit_message>
<xml_diff>
--- a/In Bearbeitung/3. Biologie Klausur 17.04.2026 (WIP).docx
+++ b/In Bearbeitung/3. Biologie Klausur 17.04.2026 (WIP).docx
@@ -791,18 +791,19 @@
           <w:rFonts w:ascii="Roboto" w:hAnsi="Roboto"/>
           <w:b/>
           <w:bCs/>
-          <w:color w:val="7030A0"/>
+          <w:color w:val="C00000"/>
           <w:sz w:val="28"/>
           <w:szCs w:val="28"/>
           <w:lang w:val="de-DE"/>
         </w:rPr>
-        <w:t>Ökologische Nische</w:t>
+        <w:t>Biotische Faktoren</w:t>
       </w:r>
       <w:r>
         <w:rPr>
           <w:rFonts w:ascii="Roboto" w:hAnsi="Roboto"/>
           <w:b/>
           <w:bCs/>
+          <w:color w:val="C00000"/>
           <w:sz w:val="28"/>
           <w:szCs w:val="28"/>
           <w:lang w:val="de-DE"/>
@@ -827,48 +828,18 @@
           <w:szCs w:val="28"/>
           <w:lang w:val="de-DE"/>
         </w:rPr>
-        <w:t xml:space="preserve">Das Wechselspiel </w:t>
-      </w:r>
-      <w:r>
+        <w:t>Einflüsse der belebten Umwelt, z. B. Konkurrenz, Fressfeinde oder Nahrung.</w:t>
+      </w:r>
+    </w:p>
+    <w:p>
+      <w:pPr>
         <w:rPr>
           <w:rFonts w:ascii="Roboto" w:hAnsi="Roboto"/>
-          <w:b/>
-          <w:bCs/>
           <w:sz w:val="28"/>
           <w:szCs w:val="28"/>
           <w:lang w:val="de-DE"/>
         </w:rPr>
-        <w:t>einer</w:t>
-      </w:r>
-      <w:r>
-        <w:rPr>
-          <w:rFonts w:ascii="Roboto" w:hAnsi="Roboto"/>
-          <w:sz w:val="28"/>
-          <w:szCs w:val="28"/>
-          <w:lang w:val="de-DE"/>
-        </w:rPr>
-        <w:t xml:space="preserve"> </w:t>
-      </w:r>
-      <w:r>
-        <w:rPr>
-          <w:rFonts w:ascii="Roboto" w:hAnsi="Roboto"/>
-          <w:b/>
-          <w:bCs/>
-          <w:sz w:val="28"/>
-          <w:szCs w:val="28"/>
-          <w:lang w:val="de-DE"/>
-        </w:rPr>
-        <w:t>Art</w:t>
-      </w:r>
-      <w:r>
-        <w:rPr>
-          <w:rFonts w:ascii="Roboto" w:hAnsi="Roboto"/>
-          <w:sz w:val="28"/>
-          <w:szCs w:val="28"/>
-          <w:lang w:val="de-DE"/>
-        </w:rPr>
-        <w:t xml:space="preserve"> mit den für sie nötigen </w:t>
-      </w:r>
+      </w:pPr>
       <w:r>
         <w:rPr>
           <w:rFonts w:ascii="Roboto" w:hAnsi="Roboto"/>
@@ -879,201 +850,8 @@
           <w:szCs w:val="28"/>
           <w:lang w:val="de-DE"/>
         </w:rPr>
-        <w:t>abiotischen</w:t>
-      </w:r>
-      <w:r>
-        <w:rPr>
-          <w:rFonts w:ascii="Roboto" w:hAnsi="Roboto"/>
-          <w:color w:val="70AD47" w:themeColor="accent6"/>
-          <w:sz w:val="28"/>
-          <w:szCs w:val="28"/>
-          <w:lang w:val="de-DE"/>
-        </w:rPr>
-        <w:t xml:space="preserve"> </w:t>
-      </w:r>
-      <w:r>
-        <w:rPr>
-          <w:rFonts w:ascii="Roboto" w:hAnsi="Roboto"/>
-          <w:sz w:val="28"/>
-          <w:szCs w:val="28"/>
-          <w:lang w:val="de-DE"/>
-        </w:rPr>
-        <w:t xml:space="preserve">und </w:t>
-      </w:r>
-      <w:r>
-        <w:rPr>
-          <w:rFonts w:ascii="Roboto" w:hAnsi="Roboto"/>
-          <w:b/>
-          <w:bCs/>
-          <w:color w:val="C00000"/>
-          <w:sz w:val="28"/>
-          <w:szCs w:val="28"/>
-          <w:lang w:val="de-DE"/>
-        </w:rPr>
-        <w:t>biotischen</w:t>
-      </w:r>
-      <w:r>
-        <w:rPr>
-          <w:rFonts w:ascii="Roboto" w:hAnsi="Roboto"/>
-          <w:color w:val="C00000"/>
-          <w:sz w:val="28"/>
-          <w:szCs w:val="28"/>
-          <w:lang w:val="de-DE"/>
-        </w:rPr>
-        <w:t xml:space="preserve"> </w:t>
-      </w:r>
-      <w:r>
-        <w:rPr>
-          <w:rFonts w:ascii="Roboto" w:hAnsi="Roboto"/>
-          <w:sz w:val="28"/>
-          <w:szCs w:val="28"/>
-          <w:lang w:val="de-DE"/>
-        </w:rPr>
-        <w:t>Umweltfaktoren</w:t>
-      </w:r>
-      <w:r>
-        <w:rPr>
-          <w:rFonts w:ascii="Roboto" w:hAnsi="Roboto"/>
-          <w:sz w:val="28"/>
-          <w:szCs w:val="28"/>
-          <w:lang w:val="de-DE"/>
-        </w:rPr>
-        <w:t xml:space="preserve"> </w:t>
-      </w:r>
-      <w:r>
-        <w:rPr>
-          <w:rFonts w:ascii="Roboto" w:hAnsi="Roboto"/>
-          <w:b/>
-          <w:bCs/>
-          <w:color w:val="FC24E2"/>
-          <w:sz w:val="28"/>
-          <w:szCs w:val="28"/>
-          <w:highlight w:val="yellow"/>
-          <w:u w:val="single"/>
-          <w:lang w:val="de-DE"/>
-        </w:rPr>
-        <w:t xml:space="preserve">(Muss noch </w:t>
-      </w:r>
-      <w:r>
-        <w:rPr>
-          <w:rFonts w:ascii="Roboto" w:hAnsi="Roboto"/>
-          <w:b/>
-          <w:bCs/>
-          <w:color w:val="FC24E2"/>
-          <w:sz w:val="28"/>
-          <w:szCs w:val="28"/>
-          <w:highlight w:val="yellow"/>
-          <w:u w:val="single"/>
-          <w:lang w:val="de-DE"/>
-        </w:rPr>
-        <w:t>erläutern</w:t>
-      </w:r>
-      <w:r>
-        <w:rPr>
-          <w:rFonts w:ascii="Roboto" w:hAnsi="Roboto"/>
-          <w:b/>
-          <w:bCs/>
-          <w:color w:val="FC24E2"/>
-          <w:sz w:val="28"/>
-          <w:szCs w:val="28"/>
-          <w:highlight w:val="yellow"/>
-          <w:u w:val="single"/>
-          <w:lang w:val="de-DE"/>
-        </w:rPr>
-        <w:t>!!!</w:t>
-      </w:r>
-      <w:r>
-        <w:rPr>
-          <w:rFonts w:ascii="Roboto" w:hAnsi="Roboto"/>
-          <w:b/>
-          <w:bCs/>
-          <w:color w:val="FC24E2"/>
-          <w:sz w:val="28"/>
-          <w:szCs w:val="28"/>
-          <w:highlight w:val="yellow"/>
-          <w:u w:val="single"/>
-          <w:lang w:val="de-DE"/>
-        </w:rPr>
-        <w:t>)</w:t>
-      </w:r>
-      <w:r>
-        <w:rPr>
-          <w:rFonts w:ascii="Roboto" w:hAnsi="Roboto"/>
-          <w:b/>
-          <w:bCs/>
-          <w:color w:val="FC24E2"/>
-          <w:sz w:val="28"/>
-          <w:szCs w:val="28"/>
-          <w:highlight w:val="yellow"/>
-          <w:u w:val="single"/>
-          <w:lang w:val="de-DE"/>
-        </w:rPr>
-        <w:t xml:space="preserve"> </w:t>
-      </w:r>
-    </w:p>
-    <w:p>
-      <w:pPr>
-        <w:rPr>
-          <w:rFonts w:ascii="Roboto" w:hAnsi="Roboto"/>
-          <w:sz w:val="28"/>
-          <w:szCs w:val="28"/>
-          <w:lang w:val="de-DE"/>
-        </w:rPr>
-      </w:pPr>
-      <w:r>
-        <w:rPr>
-          <w:rFonts w:ascii="Roboto" w:hAnsi="Roboto"/>
-          <w:b/>
-          <w:bCs/>
-          <w:color w:val="C00000"/>
-          <w:sz w:val="28"/>
-          <w:szCs w:val="28"/>
-          <w:lang w:val="de-DE"/>
-        </w:rPr>
-        <w:t>Biotische Faktoren</w:t>
-      </w:r>
-      <w:r>
-        <w:rPr>
-          <w:rFonts w:ascii="Roboto" w:hAnsi="Roboto"/>
-          <w:b/>
-          <w:bCs/>
-          <w:color w:val="C00000"/>
-          <w:sz w:val="28"/>
-          <w:szCs w:val="28"/>
-          <w:lang w:val="de-DE"/>
-        </w:rPr>
-        <w:t>:</w:t>
-      </w:r>
-      <w:r>
-        <w:rPr>
-          <w:rFonts w:ascii="Roboto" w:hAnsi="Roboto"/>
-          <w:b/>
-          <w:bCs/>
-          <w:sz w:val="28"/>
-          <w:szCs w:val="28"/>
-          <w:lang w:val="de-DE"/>
-        </w:rPr>
-        <w:t xml:space="preserve"> </w:t>
-      </w:r>
-      <w:r>
-        <w:rPr>
-          <w:rFonts w:ascii="Roboto" w:hAnsi="Roboto"/>
-          <w:sz w:val="28"/>
-          <w:szCs w:val="28"/>
-          <w:lang w:val="de-DE"/>
-        </w:rPr>
-        <w:t>Einflüsse der belebten Umwelt, z. B. Konkurrenz, Fressfeinde oder Nahrung.</w:t>
-      </w:r>
-    </w:p>
-    <w:p>
-      <w:pPr>
-        <w:rPr>
-          <w:rFonts w:ascii="Roboto" w:hAnsi="Roboto"/>
-          <w:sz w:val="28"/>
-          <w:szCs w:val="28"/>
-          <w:lang w:val="de-DE"/>
-        </w:rPr>
-      </w:pPr>
+        <w:t>Abiotische Faktoren</w:t>
+      </w:r>
       <w:r>
         <w:rPr>
           <w:rFonts w:ascii="Roboto" w:hAnsi="Roboto"/>
@@ -1084,29 +862,65 @@
           <w:szCs w:val="28"/>
           <w:lang w:val="de-DE"/>
         </w:rPr>
-        <w:t>Abiotische Faktoren</w:t>
-      </w:r>
-      <w:r>
+        <w:t xml:space="preserve">: </w:t>
+      </w:r>
+      <w:r>
+        <w:rPr>
+          <w:rFonts w:ascii="Roboto" w:hAnsi="Roboto"/>
+          <w:sz w:val="28"/>
+          <w:szCs w:val="28"/>
+          <w:lang w:val="de-DE"/>
+        </w:rPr>
+        <w:t>Einflüsse der unbelebten Umwelt, z. B. Licht, Temperatur, Wasser oder Boden.</w:t>
+      </w:r>
+    </w:p>
+    <w:p>
+      <w:pPr>
         <w:rPr>
           <w:rFonts w:ascii="Roboto" w:hAnsi="Roboto"/>
           <w:b/>
           <w:bCs/>
-          <w:color w:val="70AD47" w:themeColor="accent6"/>
           <w:sz w:val="28"/>
           <w:szCs w:val="28"/>
           <w:lang w:val="de-DE"/>
         </w:rPr>
-        <w:t xml:space="preserve">: </w:t>
-      </w:r>
-      <w:r>
+      </w:pPr>
+    </w:p>
+    <w:p>
+      <w:pPr>
         <w:rPr>
           <w:rFonts w:ascii="Roboto" w:hAnsi="Roboto"/>
+          <w:b/>
+          <w:bCs/>
           <w:sz w:val="28"/>
           <w:szCs w:val="28"/>
           <w:lang w:val="de-DE"/>
         </w:rPr>
-        <w:t>Einflüsse der unbelebten Umwelt, z. B. Licht, Temperatur, Wasser oder Boden.</w:t>
-      </w:r>
+      </w:pPr>
+    </w:p>
+    <w:p>
+      <w:pPr>
+        <w:rPr>
+          <w:rFonts w:ascii="Roboto" w:hAnsi="Roboto"/>
+          <w:b/>
+          <w:bCs/>
+          <w:sz w:val="28"/>
+          <w:szCs w:val="28"/>
+          <w:lang w:val="de-DE"/>
+        </w:rPr>
+      </w:pPr>
+    </w:p>
+    <w:p>
+      <w:pPr>
+        <w:rPr>
+          <w:rFonts w:ascii="Roboto" w:hAnsi="Roboto"/>
+          <w:b/>
+          <w:bCs/>
+          <w:sz w:val="28"/>
+          <w:szCs w:val="28"/>
+          <w:lang w:val="de-DE"/>
+        </w:rPr>
+      </w:pPr>
     </w:p>
     <w:p>
       <w:pPr>
@@ -1173,6 +987,7 @@
         <w:pStyle w:val="Thema"/>
       </w:pPr>
       <w:r>
+        <w:lastRenderedPageBreak/>
         <w:t>Ökologische Potenz und Toleranzkurven</w:t>
       </w:r>
     </w:p>
@@ -1201,7 +1016,6 @@
           <w:sz w:val="52"/>
           <w:szCs w:val="52"/>
         </w:rPr>
-        <w:lastRenderedPageBreak/>
         <w:drawing>
           <wp:anchor distT="0" distB="0" distL="114300" distR="114300" simplePos="0" relativeHeight="251660288" behindDoc="0" locked="0" layoutInCell="1" allowOverlap="1" wp14:anchorId="6DBA7E1C" wp14:editId="07D514BC">
             <wp:simplePos x="0" y="0"/>
@@ -1838,6 +1652,7 @@
           <w:sz w:val="24"/>
           <w:szCs w:val="24"/>
         </w:rPr>
+        <w:lastRenderedPageBreak/>
         <w:t>Minimum</w:t>
       </w:r>
       <w:r>
@@ -2078,7 +1893,6 @@
           <w:sz w:val="24"/>
           <w:szCs w:val="24"/>
         </w:rPr>
-        <w:lastRenderedPageBreak/>
         <w:t>Euryök:</w:t>
       </w:r>
     </w:p>
@@ -3042,25 +2856,339 @@
     </w:p>
     <w:p>
       <w:pPr>
-        <w:pStyle w:val="Thema"/>
-        <w:rPr>
-          <w:b w:val="0"/>
-          <w:bCs w:val="0"/>
-          <w:color w:val="auto"/>
-          <w:sz w:val="24"/>
-          <w:szCs w:val="24"/>
-        </w:rPr>
+        <w:pStyle w:val="Unterthema"/>
       </w:pPr>
+      <w:r>
+        <w:lastRenderedPageBreak/>
+        <w:t xml:space="preserve">Physiologische und </w:t>
+      </w:r>
+      <w:r>
+        <w:t>Ökologische Potenz</w:t>
+      </w:r>
     </w:p>
     <w:p>
       <w:pPr>
         <w:pStyle w:val="Unterthema"/>
+        <w:rPr>
+          <w:b w:val="0"/>
+          <w:bCs w:val="0"/>
+          <w:color w:val="auto"/>
+          <w:sz w:val="24"/>
+          <w:szCs w:val="24"/>
+        </w:rPr>
       </w:pPr>
       <w:r>
-        <w:t xml:space="preserve">Physiologische und </w:t>
-      </w:r>
-      <w:r>
-        <w:t>Ökologische Potenz</w:t>
+        <w:rPr>
+          <w:color w:val="FFC000" w:themeColor="accent4"/>
+          <w:sz w:val="24"/>
+          <w:szCs w:val="24"/>
+        </w:rPr>
+        <w:t>Physiologische Potenz:</w:t>
+      </w:r>
+      <w:r>
+        <w:rPr>
+          <w:b w:val="0"/>
+          <w:bCs w:val="0"/>
+          <w:color w:val="auto"/>
+          <w:sz w:val="24"/>
+          <w:szCs w:val="24"/>
+        </w:rPr>
+        <w:t xml:space="preserve"> Fähigkeit eines </w:t>
+      </w:r>
+      <w:r>
+        <w:rPr>
+          <w:color w:val="auto"/>
+          <w:sz w:val="24"/>
+          <w:szCs w:val="24"/>
+        </w:rPr>
+        <w:t>Organismus</w:t>
+      </w:r>
+      <w:r>
+        <w:rPr>
+          <w:b w:val="0"/>
+          <w:bCs w:val="0"/>
+          <w:color w:val="auto"/>
+          <w:sz w:val="24"/>
+          <w:szCs w:val="24"/>
+        </w:rPr>
+        <w:t xml:space="preserve">, </w:t>
+      </w:r>
+      <w:r>
+        <w:rPr>
+          <w:color w:val="70AD47" w:themeColor="accent6"/>
+          <w:sz w:val="24"/>
+          <w:szCs w:val="24"/>
+        </w:rPr>
+        <w:t>Schwankungen</w:t>
+      </w:r>
+      <w:r>
+        <w:rPr>
+          <w:b w:val="0"/>
+          <w:bCs w:val="0"/>
+          <w:color w:val="70AD47" w:themeColor="accent6"/>
+          <w:sz w:val="24"/>
+          <w:szCs w:val="24"/>
+        </w:rPr>
+        <w:t xml:space="preserve"> </w:t>
+      </w:r>
+      <w:r>
+        <w:rPr>
+          <w:color w:val="70AD47" w:themeColor="accent6"/>
+          <w:sz w:val="24"/>
+          <w:szCs w:val="24"/>
+        </w:rPr>
+        <w:t>von</w:t>
+      </w:r>
+      <w:r>
+        <w:rPr>
+          <w:b w:val="0"/>
+          <w:bCs w:val="0"/>
+          <w:color w:val="70AD47" w:themeColor="accent6"/>
+          <w:sz w:val="24"/>
+          <w:szCs w:val="24"/>
+        </w:rPr>
+        <w:t xml:space="preserve"> </w:t>
+      </w:r>
+      <w:r>
+        <w:rPr>
+          <w:color w:val="70AD47" w:themeColor="accent6"/>
+          <w:sz w:val="24"/>
+          <w:szCs w:val="24"/>
+        </w:rPr>
+        <w:t>Umweltfaktoren</w:t>
+      </w:r>
+      <w:r>
+        <w:rPr>
+          <w:b w:val="0"/>
+          <w:bCs w:val="0"/>
+          <w:color w:val="70AD47" w:themeColor="accent6"/>
+          <w:sz w:val="24"/>
+          <w:szCs w:val="24"/>
+        </w:rPr>
+        <w:t xml:space="preserve"> </w:t>
+      </w:r>
+      <w:r>
+        <w:rPr>
+          <w:color w:val="FFC000"/>
+          <w:sz w:val="24"/>
+          <w:szCs w:val="24"/>
+          <w:u w:val="single"/>
+        </w:rPr>
+        <w:t>ohne</w:t>
+      </w:r>
+      <w:r>
+        <w:rPr>
+          <w:b w:val="0"/>
+          <w:bCs w:val="0"/>
+          <w:color w:val="FFC000"/>
+          <w:sz w:val="24"/>
+          <w:szCs w:val="24"/>
+        </w:rPr>
+        <w:t xml:space="preserve"> </w:t>
+      </w:r>
+      <w:r>
+        <w:rPr>
+          <w:color w:val="FFC000"/>
+          <w:sz w:val="24"/>
+          <w:szCs w:val="24"/>
+          <w:u w:val="single"/>
+        </w:rPr>
+        <w:t>Konkurrenz</w:t>
+      </w:r>
+      <w:r>
+        <w:rPr>
+          <w:b w:val="0"/>
+          <w:bCs w:val="0"/>
+          <w:color w:val="FFC000"/>
+          <w:sz w:val="24"/>
+          <w:szCs w:val="24"/>
+        </w:rPr>
+        <w:t xml:space="preserve"> </w:t>
+      </w:r>
+      <w:r>
+        <w:rPr>
+          <w:b w:val="0"/>
+          <w:bCs w:val="0"/>
+          <w:color w:val="auto"/>
+          <w:sz w:val="24"/>
+          <w:szCs w:val="24"/>
+        </w:rPr>
+        <w:t xml:space="preserve">zu ertragen. Bezieht sich auf </w:t>
+      </w:r>
+      <w:r>
+        <w:rPr>
+          <w:color w:val="FFC000"/>
+          <w:sz w:val="24"/>
+          <w:szCs w:val="24"/>
+          <w:u w:val="single"/>
+        </w:rPr>
+        <w:t>experimentelle</w:t>
+      </w:r>
+      <w:r>
+        <w:rPr>
+          <w:b w:val="0"/>
+          <w:bCs w:val="0"/>
+          <w:color w:val="FFC000"/>
+          <w:sz w:val="24"/>
+          <w:szCs w:val="24"/>
+        </w:rPr>
+        <w:t xml:space="preserve"> </w:t>
+      </w:r>
+      <w:r>
+        <w:rPr>
+          <w:color w:val="FFC000"/>
+          <w:sz w:val="24"/>
+          <w:szCs w:val="24"/>
+          <w:u w:val="single"/>
+        </w:rPr>
+        <w:t>Idealbedingungen</w:t>
+      </w:r>
+      <w:r>
+        <w:rPr>
+          <w:b w:val="0"/>
+          <w:bCs w:val="0"/>
+          <w:color w:val="auto"/>
+          <w:sz w:val="24"/>
+          <w:szCs w:val="24"/>
+        </w:rPr>
+        <w:t xml:space="preserve">. Umfasst das </w:t>
+      </w:r>
+      <w:r>
+        <w:rPr>
+          <w:color w:val="FFC000"/>
+          <w:sz w:val="24"/>
+          <w:szCs w:val="24"/>
+          <w:u w:val="single"/>
+        </w:rPr>
+        <w:t>theoretische</w:t>
+      </w:r>
+      <w:r>
+        <w:rPr>
+          <w:b w:val="0"/>
+          <w:bCs w:val="0"/>
+          <w:color w:val="FFC000"/>
+          <w:sz w:val="24"/>
+          <w:szCs w:val="24"/>
+        </w:rPr>
+        <w:t xml:space="preserve"> </w:t>
+      </w:r>
+      <w:r>
+        <w:rPr>
+          <w:color w:val="auto"/>
+          <w:sz w:val="24"/>
+          <w:szCs w:val="24"/>
+        </w:rPr>
+        <w:t>Maximum</w:t>
+      </w:r>
+      <w:r>
+        <w:rPr>
+          <w:b w:val="0"/>
+          <w:bCs w:val="0"/>
+          <w:color w:val="auto"/>
+          <w:sz w:val="24"/>
+          <w:szCs w:val="24"/>
+        </w:rPr>
+        <w:t xml:space="preserve"> an </w:t>
+      </w:r>
+      <w:r>
+        <w:rPr>
+          <w:color w:val="auto"/>
+          <w:sz w:val="24"/>
+          <w:szCs w:val="24"/>
+        </w:rPr>
+        <w:t>Überleben</w:t>
+      </w:r>
+      <w:r>
+        <w:rPr>
+          <w:b w:val="0"/>
+          <w:bCs w:val="0"/>
+          <w:color w:val="auto"/>
+          <w:sz w:val="24"/>
+          <w:szCs w:val="24"/>
+        </w:rPr>
+        <w:t xml:space="preserve"> </w:t>
+      </w:r>
+      <w:r>
+        <w:rPr>
+          <w:color w:val="auto"/>
+          <w:sz w:val="24"/>
+          <w:szCs w:val="24"/>
+        </w:rPr>
+        <w:t>und</w:t>
+      </w:r>
+      <w:r>
+        <w:rPr>
+          <w:b w:val="0"/>
+          <w:bCs w:val="0"/>
+          <w:color w:val="auto"/>
+          <w:sz w:val="24"/>
+          <w:szCs w:val="24"/>
+        </w:rPr>
+        <w:t xml:space="preserve"> </w:t>
+      </w:r>
+      <w:r>
+        <w:rPr>
+          <w:color w:val="auto"/>
+          <w:sz w:val="24"/>
+          <w:szCs w:val="24"/>
+        </w:rPr>
+        <w:t>Fortpflanzung</w:t>
+      </w:r>
+      <w:r>
+        <w:rPr>
+          <w:b w:val="0"/>
+          <w:bCs w:val="0"/>
+          <w:color w:val="auto"/>
+          <w:sz w:val="24"/>
+          <w:szCs w:val="24"/>
+        </w:rPr>
+        <w:t xml:space="preserve">. Wird nur durch </w:t>
+      </w:r>
+      <w:r>
+        <w:rPr>
+          <w:color w:val="70AD47" w:themeColor="accent6"/>
+          <w:sz w:val="24"/>
+          <w:szCs w:val="24"/>
+        </w:rPr>
+        <w:t>abiotische</w:t>
+      </w:r>
+      <w:r>
+        <w:rPr>
+          <w:b w:val="0"/>
+          <w:bCs w:val="0"/>
+          <w:color w:val="70AD47" w:themeColor="accent6"/>
+          <w:sz w:val="24"/>
+          <w:szCs w:val="24"/>
+        </w:rPr>
+        <w:t xml:space="preserve"> </w:t>
+      </w:r>
+      <w:r>
+        <w:rPr>
+          <w:color w:val="70AD47" w:themeColor="accent6"/>
+          <w:sz w:val="24"/>
+          <w:szCs w:val="24"/>
+        </w:rPr>
+        <w:t>Faktoren</w:t>
+      </w:r>
+      <w:r>
+        <w:rPr>
+          <w:b w:val="0"/>
+          <w:bCs w:val="0"/>
+          <w:color w:val="70AD47" w:themeColor="accent6"/>
+          <w:sz w:val="24"/>
+          <w:szCs w:val="24"/>
+        </w:rPr>
+        <w:t xml:space="preserve"> </w:t>
+      </w:r>
+      <w:r>
+        <w:rPr>
+          <w:b w:val="0"/>
+          <w:bCs w:val="0"/>
+          <w:color w:val="auto"/>
+          <w:sz w:val="24"/>
+          <w:szCs w:val="24"/>
+        </w:rPr>
+        <w:t>begrenzt.</w:t>
       </w:r>
     </w:p>
     <w:p>
@@ -3076,336 +3204,10 @@
       </w:pPr>
       <w:r>
         <w:rPr>
-          <w:color w:val="FFC000" w:themeColor="accent4"/>
-          <w:sz w:val="24"/>
-          <w:szCs w:val="24"/>
-        </w:rPr>
-        <w:t>Physiologische Potenz:</w:t>
-      </w:r>
-      <w:r>
-        <w:rPr>
-          <w:b w:val="0"/>
-          <w:bCs w:val="0"/>
-          <w:color w:val="auto"/>
-          <w:sz w:val="24"/>
-          <w:szCs w:val="24"/>
-        </w:rPr>
-        <w:t xml:space="preserve"> Fähigkeit eines </w:t>
-      </w:r>
-      <w:r>
-        <w:rPr>
-          <w:color w:val="auto"/>
-          <w:sz w:val="24"/>
-          <w:szCs w:val="24"/>
-        </w:rPr>
-        <w:t>Organismus</w:t>
-      </w:r>
-      <w:r>
-        <w:rPr>
-          <w:b w:val="0"/>
-          <w:bCs w:val="0"/>
-          <w:color w:val="auto"/>
-          <w:sz w:val="24"/>
-          <w:szCs w:val="24"/>
-        </w:rPr>
-        <w:t xml:space="preserve">, </w:t>
-      </w:r>
-      <w:r>
-        <w:rPr>
-          <w:color w:val="70AD47" w:themeColor="accent6"/>
-          <w:sz w:val="24"/>
-          <w:szCs w:val="24"/>
-        </w:rPr>
-        <w:t>Schwankungen</w:t>
-      </w:r>
-      <w:r>
-        <w:rPr>
-          <w:b w:val="0"/>
-          <w:bCs w:val="0"/>
-          <w:color w:val="70AD47" w:themeColor="accent6"/>
-          <w:sz w:val="24"/>
-          <w:szCs w:val="24"/>
-        </w:rPr>
-        <w:t xml:space="preserve"> </w:t>
-      </w:r>
-      <w:r>
-        <w:rPr>
-          <w:color w:val="70AD47" w:themeColor="accent6"/>
-          <w:sz w:val="24"/>
-          <w:szCs w:val="24"/>
-        </w:rPr>
-        <w:t>von</w:t>
-      </w:r>
-      <w:r>
-        <w:rPr>
-          <w:b w:val="0"/>
-          <w:bCs w:val="0"/>
-          <w:color w:val="70AD47" w:themeColor="accent6"/>
-          <w:sz w:val="24"/>
-          <w:szCs w:val="24"/>
-        </w:rPr>
-        <w:t xml:space="preserve"> </w:t>
-      </w:r>
-      <w:r>
-        <w:rPr>
-          <w:color w:val="70AD47" w:themeColor="accent6"/>
-          <w:sz w:val="24"/>
-          <w:szCs w:val="24"/>
-        </w:rPr>
-        <w:t>Umweltfaktoren</w:t>
-      </w:r>
-      <w:r>
-        <w:rPr>
-          <w:b w:val="0"/>
-          <w:bCs w:val="0"/>
-          <w:color w:val="70AD47" w:themeColor="accent6"/>
-          <w:sz w:val="24"/>
-          <w:szCs w:val="24"/>
-        </w:rPr>
-        <w:t xml:space="preserve"> </w:t>
-      </w:r>
-      <w:r>
-        <w:rPr>
-          <w:color w:val="FFC000"/>
-          <w:sz w:val="24"/>
-          <w:szCs w:val="24"/>
-          <w:u w:val="single"/>
-        </w:rPr>
-        <w:t>ohne</w:t>
-      </w:r>
-      <w:r>
-        <w:rPr>
-          <w:b w:val="0"/>
-          <w:bCs w:val="0"/>
-          <w:color w:val="FFC000"/>
-          <w:sz w:val="24"/>
-          <w:szCs w:val="24"/>
-        </w:rPr>
-        <w:t xml:space="preserve"> </w:t>
-      </w:r>
-      <w:r>
-        <w:rPr>
-          <w:color w:val="FFC000"/>
-          <w:sz w:val="24"/>
-          <w:szCs w:val="24"/>
-          <w:u w:val="single"/>
-        </w:rPr>
-        <w:t>Konkurrenz</w:t>
-      </w:r>
-      <w:r>
-        <w:rPr>
-          <w:b w:val="0"/>
-          <w:bCs w:val="0"/>
-          <w:color w:val="FFC000"/>
-          <w:sz w:val="24"/>
-          <w:szCs w:val="24"/>
-        </w:rPr>
-        <w:t xml:space="preserve"> </w:t>
-      </w:r>
-      <w:r>
-        <w:rPr>
-          <w:b w:val="0"/>
-          <w:bCs w:val="0"/>
-          <w:color w:val="auto"/>
-          <w:sz w:val="24"/>
-          <w:szCs w:val="24"/>
-        </w:rPr>
-        <w:t xml:space="preserve">zu ertragen. Bezieht sich auf </w:t>
-      </w:r>
-      <w:r>
-        <w:rPr>
-          <w:color w:val="FFC000"/>
-          <w:sz w:val="24"/>
-          <w:szCs w:val="24"/>
-          <w:u w:val="single"/>
-        </w:rPr>
-        <w:t>experimentelle</w:t>
-      </w:r>
-      <w:r>
-        <w:rPr>
-          <w:b w:val="0"/>
-          <w:bCs w:val="0"/>
-          <w:color w:val="FFC000"/>
-          <w:sz w:val="24"/>
-          <w:szCs w:val="24"/>
-        </w:rPr>
-        <w:t xml:space="preserve"> </w:t>
-      </w:r>
-      <w:r>
-        <w:rPr>
-          <w:color w:val="FFC000"/>
-          <w:sz w:val="24"/>
-          <w:szCs w:val="24"/>
-          <w:u w:val="single"/>
-        </w:rPr>
-        <w:t>Idealbedingungen</w:t>
-      </w:r>
-      <w:r>
-        <w:rPr>
-          <w:b w:val="0"/>
-          <w:bCs w:val="0"/>
-          <w:color w:val="auto"/>
-          <w:sz w:val="24"/>
-          <w:szCs w:val="24"/>
-        </w:rPr>
-        <w:t xml:space="preserve">. Umfasst das </w:t>
-      </w:r>
-      <w:r>
-        <w:rPr>
-          <w:color w:val="FFC000"/>
-          <w:sz w:val="24"/>
-          <w:szCs w:val="24"/>
-          <w:u w:val="single"/>
-        </w:rPr>
-        <w:t>theoretische</w:t>
-      </w:r>
-      <w:r>
-        <w:rPr>
-          <w:b w:val="0"/>
-          <w:bCs w:val="0"/>
-          <w:color w:val="FFC000"/>
-          <w:sz w:val="24"/>
-          <w:szCs w:val="24"/>
-        </w:rPr>
-        <w:t xml:space="preserve"> </w:t>
-      </w:r>
-      <w:r>
-        <w:rPr>
-          <w:color w:val="auto"/>
-          <w:sz w:val="24"/>
-          <w:szCs w:val="24"/>
-        </w:rPr>
-        <w:t>Maximum</w:t>
-      </w:r>
-      <w:r>
-        <w:rPr>
-          <w:b w:val="0"/>
-          <w:bCs w:val="0"/>
-          <w:color w:val="auto"/>
-          <w:sz w:val="24"/>
-          <w:szCs w:val="24"/>
-        </w:rPr>
-        <w:t xml:space="preserve"> an </w:t>
-      </w:r>
-      <w:r>
-        <w:rPr>
-          <w:color w:val="auto"/>
-          <w:sz w:val="24"/>
-          <w:szCs w:val="24"/>
-        </w:rPr>
-        <w:t>Überleben</w:t>
-      </w:r>
-      <w:r>
-        <w:rPr>
-          <w:b w:val="0"/>
-          <w:bCs w:val="0"/>
-          <w:color w:val="auto"/>
-          <w:sz w:val="24"/>
-          <w:szCs w:val="24"/>
-        </w:rPr>
-        <w:t xml:space="preserve"> </w:t>
-      </w:r>
-      <w:r>
-        <w:rPr>
-          <w:color w:val="auto"/>
-          <w:sz w:val="24"/>
-          <w:szCs w:val="24"/>
-        </w:rPr>
-        <w:t>und</w:t>
-      </w:r>
-      <w:r>
-        <w:rPr>
-          <w:b w:val="0"/>
-          <w:bCs w:val="0"/>
-          <w:color w:val="auto"/>
-          <w:sz w:val="24"/>
-          <w:szCs w:val="24"/>
-        </w:rPr>
-        <w:t xml:space="preserve"> </w:t>
-      </w:r>
-      <w:r>
-        <w:rPr>
-          <w:color w:val="auto"/>
-          <w:sz w:val="24"/>
-          <w:szCs w:val="24"/>
-        </w:rPr>
-        <w:t>Fortpflanzung</w:t>
-      </w:r>
-      <w:r>
-        <w:rPr>
-          <w:b w:val="0"/>
-          <w:bCs w:val="0"/>
-          <w:color w:val="auto"/>
-          <w:sz w:val="24"/>
-          <w:szCs w:val="24"/>
-        </w:rPr>
-        <w:t xml:space="preserve">. Wird nur durch </w:t>
-      </w:r>
-      <w:r>
-        <w:rPr>
-          <w:color w:val="70AD47" w:themeColor="accent6"/>
-          <w:sz w:val="24"/>
-          <w:szCs w:val="24"/>
-        </w:rPr>
-        <w:t>abiotische</w:t>
-      </w:r>
-      <w:r>
-        <w:rPr>
-          <w:b w:val="0"/>
-          <w:bCs w:val="0"/>
-          <w:color w:val="70AD47" w:themeColor="accent6"/>
-          <w:sz w:val="24"/>
-          <w:szCs w:val="24"/>
-        </w:rPr>
-        <w:t xml:space="preserve"> </w:t>
-      </w:r>
-      <w:r>
-        <w:rPr>
-          <w:color w:val="70AD47" w:themeColor="accent6"/>
-          <w:sz w:val="24"/>
-          <w:szCs w:val="24"/>
-        </w:rPr>
-        <w:t>Faktoren</w:t>
-      </w:r>
-      <w:r>
-        <w:rPr>
-          <w:b w:val="0"/>
-          <w:bCs w:val="0"/>
-          <w:color w:val="70AD47" w:themeColor="accent6"/>
-          <w:sz w:val="24"/>
-          <w:szCs w:val="24"/>
-        </w:rPr>
-        <w:t xml:space="preserve"> </w:t>
-      </w:r>
-      <w:r>
-        <w:rPr>
-          <w:b w:val="0"/>
-          <w:bCs w:val="0"/>
-          <w:color w:val="auto"/>
-          <w:sz w:val="24"/>
-          <w:szCs w:val="24"/>
-        </w:rPr>
-        <w:t>begrenzt.</w:t>
-      </w:r>
-    </w:p>
-    <w:p>
-      <w:pPr>
-        <w:pStyle w:val="Unterthema"/>
-        <w:rPr>
-          <w:b w:val="0"/>
-          <w:bCs w:val="0"/>
-          <w:color w:val="auto"/>
-          <w:sz w:val="24"/>
-          <w:szCs w:val="24"/>
-        </w:rPr>
-      </w:pPr>
-      <w:r>
-        <w:rPr>
           <w:color w:val="FF0000"/>
           <w:sz w:val="24"/>
           <w:szCs w:val="24"/>
         </w:rPr>
-        <w:lastRenderedPageBreak/>
         <w:t>Ökologische Potenz:</w:t>
       </w:r>
       <w:r>
@@ -3772,6 +3574,1093 @@
       <w:pPr>
         <w:pStyle w:val="Unterthema"/>
         <w:rPr>
+          <w:b w:val="0"/>
+          <w:bCs w:val="0"/>
+          <w:color w:val="auto"/>
+          <w:sz w:val="24"/>
+          <w:szCs w:val="24"/>
+        </w:rPr>
+      </w:pPr>
+    </w:p>
+    <w:p>
+      <w:pPr>
+        <w:pStyle w:val="Unterthema"/>
+        <w:rPr>
+          <w:b w:val="0"/>
+          <w:bCs w:val="0"/>
+          <w:color w:val="auto"/>
+          <w:sz w:val="24"/>
+          <w:szCs w:val="24"/>
+        </w:rPr>
+      </w:pPr>
+    </w:p>
+    <w:p>
+      <w:pPr>
+        <w:pStyle w:val="Unterthema"/>
+        <w:rPr>
+          <w:b w:val="0"/>
+          <w:bCs w:val="0"/>
+          <w:color w:val="auto"/>
+          <w:sz w:val="24"/>
+          <w:szCs w:val="24"/>
+        </w:rPr>
+      </w:pPr>
+    </w:p>
+    <w:p>
+      <w:pPr>
+        <w:pStyle w:val="Unterthema"/>
+        <w:rPr>
+          <w:b w:val="0"/>
+          <w:bCs w:val="0"/>
+          <w:color w:val="auto"/>
+          <w:sz w:val="24"/>
+          <w:szCs w:val="24"/>
+        </w:rPr>
+      </w:pPr>
+    </w:p>
+    <w:p>
+      <w:pPr>
+        <w:pStyle w:val="Unterthema"/>
+        <w:rPr>
+          <w:b w:val="0"/>
+          <w:bCs w:val="0"/>
+          <w:color w:val="auto"/>
+          <w:sz w:val="24"/>
+          <w:szCs w:val="24"/>
+        </w:rPr>
+      </w:pPr>
+    </w:p>
+    <w:p>
+      <w:pPr>
+        <w:pStyle w:val="Unterthema"/>
+        <w:rPr>
+          <w:b w:val="0"/>
+          <w:bCs w:val="0"/>
+          <w:color w:val="auto"/>
+          <w:sz w:val="24"/>
+          <w:szCs w:val="24"/>
+        </w:rPr>
+      </w:pPr>
+    </w:p>
+    <w:p>
+      <w:pPr>
+        <w:pStyle w:val="Unterthema"/>
+        <w:rPr>
+          <w:b w:val="0"/>
+          <w:bCs w:val="0"/>
+          <w:color w:val="auto"/>
+          <w:sz w:val="24"/>
+          <w:szCs w:val="24"/>
+        </w:rPr>
+      </w:pPr>
+    </w:p>
+    <w:p>
+      <w:pPr>
+        <w:pStyle w:val="Unterthema"/>
+        <w:rPr>
+          <w:b w:val="0"/>
+          <w:bCs w:val="0"/>
+          <w:color w:val="auto"/>
+          <w:sz w:val="24"/>
+          <w:szCs w:val="24"/>
+        </w:rPr>
+      </w:pPr>
+    </w:p>
+    <w:p>
+      <w:pPr>
+        <w:pStyle w:val="Unterthema"/>
+        <w:rPr>
+          <w:b w:val="0"/>
+          <w:bCs w:val="0"/>
+          <w:color w:val="auto"/>
+          <w:sz w:val="24"/>
+          <w:szCs w:val="24"/>
+        </w:rPr>
+      </w:pPr>
+    </w:p>
+    <w:p>
+      <w:pPr>
+        <w:pStyle w:val="Unterthema"/>
+        <w:rPr>
+          <w:b w:val="0"/>
+          <w:bCs w:val="0"/>
+          <w:color w:val="auto"/>
+          <w:sz w:val="24"/>
+          <w:szCs w:val="24"/>
+        </w:rPr>
+      </w:pPr>
+    </w:p>
+    <w:p>
+      <w:pPr>
+        <w:pStyle w:val="Thema"/>
+      </w:pPr>
+      <w:r>
+        <w:lastRenderedPageBreak/>
+        <w:t>Ökologische Nische</w:t>
+      </w:r>
+    </w:p>
+    <w:p>
+      <w:pPr>
+        <w:rPr>
+          <w:rFonts w:ascii="Roboto" w:hAnsi="Roboto"/>
+          <w:sz w:val="28"/>
+          <w:szCs w:val="28"/>
+          <w:lang w:val="de-DE"/>
+        </w:rPr>
+      </w:pPr>
+      <w:r>
+        <w:rPr>
+          <w:rFonts w:ascii="Roboto" w:hAnsi="Roboto"/>
+          <w:sz w:val="28"/>
+          <w:szCs w:val="28"/>
+          <w:lang w:val="de-DE"/>
+        </w:rPr>
+        <w:t xml:space="preserve">Ökologische Nische ist das Wechselspiel </w:t>
+      </w:r>
+      <w:r>
+        <w:rPr>
+          <w:rFonts w:ascii="Roboto" w:hAnsi="Roboto"/>
+          <w:b/>
+          <w:bCs/>
+          <w:sz w:val="28"/>
+          <w:szCs w:val="28"/>
+          <w:lang w:val="de-DE"/>
+        </w:rPr>
+        <w:t>einer</w:t>
+      </w:r>
+      <w:r>
+        <w:rPr>
+          <w:rFonts w:ascii="Roboto" w:hAnsi="Roboto"/>
+          <w:sz w:val="28"/>
+          <w:szCs w:val="28"/>
+          <w:lang w:val="de-DE"/>
+        </w:rPr>
+        <w:t xml:space="preserve"> </w:t>
+      </w:r>
+      <w:r>
+        <w:rPr>
+          <w:rFonts w:ascii="Roboto" w:hAnsi="Roboto"/>
+          <w:b/>
+          <w:bCs/>
+          <w:sz w:val="28"/>
+          <w:szCs w:val="28"/>
+          <w:lang w:val="de-DE"/>
+        </w:rPr>
+        <w:t>Art</w:t>
+      </w:r>
+      <w:r>
+        <w:rPr>
+          <w:rFonts w:ascii="Roboto" w:hAnsi="Roboto"/>
+          <w:sz w:val="28"/>
+          <w:szCs w:val="28"/>
+          <w:lang w:val="de-DE"/>
+        </w:rPr>
+        <w:t xml:space="preserve"> mit den für sie nötigen </w:t>
+      </w:r>
+      <w:r>
+        <w:rPr>
+          <w:rFonts w:ascii="Roboto" w:hAnsi="Roboto"/>
+          <w:b/>
+          <w:bCs/>
+          <w:color w:val="70AD47" w:themeColor="accent6"/>
+          <w:sz w:val="28"/>
+          <w:szCs w:val="28"/>
+          <w:lang w:val="de-DE"/>
+        </w:rPr>
+        <w:t>abiotischen</w:t>
+      </w:r>
+      <w:r>
+        <w:rPr>
+          <w:rFonts w:ascii="Roboto" w:hAnsi="Roboto"/>
+          <w:color w:val="70AD47" w:themeColor="accent6"/>
+          <w:sz w:val="28"/>
+          <w:szCs w:val="28"/>
+          <w:lang w:val="de-DE"/>
+        </w:rPr>
+        <w:t xml:space="preserve"> </w:t>
+      </w:r>
+      <w:r>
+        <w:rPr>
+          <w:rFonts w:ascii="Roboto" w:hAnsi="Roboto"/>
+          <w:sz w:val="28"/>
+          <w:szCs w:val="28"/>
+          <w:lang w:val="de-DE"/>
+        </w:rPr>
+        <w:t xml:space="preserve">und </w:t>
+      </w:r>
+      <w:r>
+        <w:rPr>
+          <w:rFonts w:ascii="Roboto" w:hAnsi="Roboto"/>
+          <w:b/>
+          <w:bCs/>
+          <w:color w:val="C00000"/>
+          <w:sz w:val="28"/>
+          <w:szCs w:val="28"/>
+          <w:lang w:val="de-DE"/>
+        </w:rPr>
+        <w:t>biotischen</w:t>
+      </w:r>
+      <w:r>
+        <w:rPr>
+          <w:rFonts w:ascii="Roboto" w:hAnsi="Roboto"/>
+          <w:color w:val="C00000"/>
+          <w:sz w:val="28"/>
+          <w:szCs w:val="28"/>
+          <w:lang w:val="de-DE"/>
+        </w:rPr>
+        <w:t xml:space="preserve"> </w:t>
+      </w:r>
+      <w:r>
+        <w:rPr>
+          <w:rFonts w:ascii="Roboto" w:hAnsi="Roboto"/>
+          <w:sz w:val="28"/>
+          <w:szCs w:val="28"/>
+          <w:lang w:val="de-DE"/>
+        </w:rPr>
+        <w:t xml:space="preserve">Umweltfaktoren. </w:t>
+      </w:r>
+      <w:r>
+        <w:rPr>
+          <w:rFonts w:ascii="Roboto" w:hAnsi="Roboto"/>
+          <w:sz w:val="28"/>
+          <w:szCs w:val="28"/>
+          <w:lang w:val="de-DE"/>
+        </w:rPr>
+        <w:t xml:space="preserve">Sie umfasst </w:t>
+      </w:r>
+      <w:r>
+        <w:rPr>
+          <w:rFonts w:ascii="Roboto" w:hAnsi="Roboto"/>
+          <w:b/>
+          <w:bCs/>
+          <w:sz w:val="28"/>
+          <w:szCs w:val="28"/>
+          <w:lang w:val="de-DE"/>
+        </w:rPr>
+        <w:t>alle</w:t>
+      </w:r>
+      <w:r>
+        <w:rPr>
+          <w:rFonts w:ascii="Roboto" w:hAnsi="Roboto"/>
+          <w:sz w:val="28"/>
+          <w:szCs w:val="28"/>
+          <w:lang w:val="de-DE"/>
+        </w:rPr>
+        <w:t xml:space="preserve"> </w:t>
+      </w:r>
+      <w:r>
+        <w:rPr>
+          <w:rFonts w:ascii="Roboto" w:hAnsi="Roboto"/>
+          <w:b/>
+          <w:bCs/>
+          <w:sz w:val="28"/>
+          <w:szCs w:val="28"/>
+          <w:lang w:val="de-DE"/>
+        </w:rPr>
+        <w:t>Faktoren</w:t>
+      </w:r>
+      <w:r>
+        <w:rPr>
+          <w:rFonts w:ascii="Roboto" w:hAnsi="Roboto"/>
+          <w:sz w:val="28"/>
+          <w:szCs w:val="28"/>
+          <w:lang w:val="de-DE"/>
+        </w:rPr>
+        <w:t xml:space="preserve">, die </w:t>
+      </w:r>
+      <w:r>
+        <w:rPr>
+          <w:rFonts w:ascii="Roboto" w:hAnsi="Roboto"/>
+          <w:b/>
+          <w:bCs/>
+          <w:sz w:val="28"/>
+          <w:szCs w:val="28"/>
+          <w:lang w:val="de-DE"/>
+        </w:rPr>
+        <w:t>das</w:t>
+      </w:r>
+      <w:r>
+        <w:rPr>
+          <w:rFonts w:ascii="Roboto" w:hAnsi="Roboto"/>
+          <w:sz w:val="28"/>
+          <w:szCs w:val="28"/>
+          <w:lang w:val="de-DE"/>
+        </w:rPr>
+        <w:t xml:space="preserve"> </w:t>
+      </w:r>
+      <w:r>
+        <w:rPr>
+          <w:rFonts w:ascii="Roboto" w:hAnsi="Roboto"/>
+          <w:b/>
+          <w:bCs/>
+          <w:sz w:val="28"/>
+          <w:szCs w:val="28"/>
+          <w:lang w:val="de-DE"/>
+        </w:rPr>
+        <w:t>Überleben</w:t>
+      </w:r>
+      <w:r>
+        <w:rPr>
+          <w:rFonts w:ascii="Roboto" w:hAnsi="Roboto"/>
+          <w:sz w:val="28"/>
+          <w:szCs w:val="28"/>
+          <w:lang w:val="de-DE"/>
+        </w:rPr>
+        <w:t xml:space="preserve">, </w:t>
+      </w:r>
+      <w:r>
+        <w:rPr>
+          <w:rFonts w:ascii="Roboto" w:hAnsi="Roboto"/>
+          <w:b/>
+          <w:bCs/>
+          <w:sz w:val="28"/>
+          <w:szCs w:val="28"/>
+          <w:lang w:val="de-DE"/>
+        </w:rPr>
+        <w:t>Wachstum</w:t>
+      </w:r>
+      <w:r>
+        <w:rPr>
+          <w:rFonts w:ascii="Roboto" w:hAnsi="Roboto"/>
+          <w:sz w:val="28"/>
+          <w:szCs w:val="28"/>
+          <w:lang w:val="de-DE"/>
+        </w:rPr>
+        <w:t xml:space="preserve"> und </w:t>
+      </w:r>
+      <w:r>
+        <w:rPr>
+          <w:rFonts w:ascii="Roboto" w:hAnsi="Roboto"/>
+          <w:b/>
+          <w:bCs/>
+          <w:sz w:val="28"/>
+          <w:szCs w:val="28"/>
+          <w:lang w:val="de-DE"/>
+        </w:rPr>
+        <w:t>die</w:t>
+      </w:r>
+      <w:r>
+        <w:rPr>
+          <w:rFonts w:ascii="Roboto" w:hAnsi="Roboto"/>
+          <w:sz w:val="28"/>
+          <w:szCs w:val="28"/>
+          <w:lang w:val="de-DE"/>
+        </w:rPr>
+        <w:t xml:space="preserve"> </w:t>
+      </w:r>
+      <w:r>
+        <w:rPr>
+          <w:rFonts w:ascii="Roboto" w:hAnsi="Roboto"/>
+          <w:b/>
+          <w:bCs/>
+          <w:sz w:val="28"/>
+          <w:szCs w:val="28"/>
+          <w:lang w:val="de-DE"/>
+        </w:rPr>
+        <w:t>Fortpflanzung</w:t>
+      </w:r>
+      <w:r>
+        <w:rPr>
+          <w:rFonts w:ascii="Roboto" w:hAnsi="Roboto"/>
+          <w:sz w:val="28"/>
+          <w:szCs w:val="28"/>
+          <w:lang w:val="de-DE"/>
+        </w:rPr>
+        <w:t xml:space="preserve"> </w:t>
+      </w:r>
+      <w:r>
+        <w:rPr>
+          <w:rFonts w:ascii="Roboto" w:hAnsi="Roboto"/>
+          <w:b/>
+          <w:bCs/>
+          <w:sz w:val="28"/>
+          <w:szCs w:val="28"/>
+          <w:lang w:val="de-DE"/>
+        </w:rPr>
+        <w:t>einer</w:t>
+      </w:r>
+      <w:r>
+        <w:rPr>
+          <w:rFonts w:ascii="Roboto" w:hAnsi="Roboto"/>
+          <w:sz w:val="28"/>
+          <w:szCs w:val="28"/>
+          <w:lang w:val="de-DE"/>
+        </w:rPr>
+        <w:t xml:space="preserve"> </w:t>
+      </w:r>
+      <w:r>
+        <w:rPr>
+          <w:rFonts w:ascii="Roboto" w:hAnsi="Roboto"/>
+          <w:b/>
+          <w:bCs/>
+          <w:sz w:val="28"/>
+          <w:szCs w:val="28"/>
+          <w:lang w:val="de-DE"/>
+        </w:rPr>
+        <w:t>Art</w:t>
+      </w:r>
+      <w:r>
+        <w:rPr>
+          <w:rFonts w:ascii="Roboto" w:hAnsi="Roboto"/>
+          <w:sz w:val="28"/>
+          <w:szCs w:val="28"/>
+          <w:lang w:val="de-DE"/>
+        </w:rPr>
+        <w:t xml:space="preserve"> beeinflussen.</w:t>
+      </w:r>
+    </w:p>
+    <w:p>
+      <w:pPr>
+        <w:rPr>
+          <w:rFonts w:ascii="Roboto" w:hAnsi="Roboto"/>
+          <w:sz w:val="28"/>
+          <w:szCs w:val="28"/>
+          <w:lang w:val="de-DE"/>
+        </w:rPr>
+      </w:pPr>
+      <w:r>
+        <w:rPr>
+          <w:rFonts w:ascii="Roboto" w:hAnsi="Roboto"/>
+          <w:sz w:val="28"/>
+          <w:szCs w:val="28"/>
+          <w:lang w:val="de-DE"/>
+        </w:rPr>
+        <w:t xml:space="preserve">Eine ökologische Nische besteht aus vielen einzelnen Umweltfaktoren, die man als </w:t>
+      </w:r>
+      <w:r>
+        <w:rPr>
+          <w:rFonts w:ascii="Roboto" w:hAnsi="Roboto"/>
+          <w:sz w:val="28"/>
+          <w:szCs w:val="28"/>
+          <w:lang w:val="de-DE"/>
+        </w:rPr>
+        <w:t>Nischendimensionen</w:t>
+      </w:r>
+      <w:r>
+        <w:rPr>
+          <w:rFonts w:ascii="Roboto" w:hAnsi="Roboto"/>
+          <w:sz w:val="28"/>
+          <w:szCs w:val="28"/>
+          <w:lang w:val="de-DE"/>
+        </w:rPr>
+        <w:t xml:space="preserve"> bezeichnet.</w:t>
+      </w:r>
+    </w:p>
+    <w:p>
+      <w:pPr>
+        <w:rPr>
+          <w:rFonts w:ascii="Roboto" w:hAnsi="Roboto"/>
+          <w:i/>
+          <w:iCs/>
+          <w:sz w:val="24"/>
+          <w:szCs w:val="24"/>
+          <w:lang w:val="de-DE"/>
+        </w:rPr>
+      </w:pPr>
+      <w:r>
+        <w:rPr>
+          <w:rFonts w:ascii="Roboto" w:hAnsi="Roboto"/>
+          <w:i/>
+          <w:iCs/>
+          <w:sz w:val="24"/>
+          <w:szCs w:val="24"/>
+          <w:lang w:val="de-DE"/>
+        </w:rPr>
+        <w:t>Beispiele: Temperaturbereich, Nahrung, Feuchtigkeit, Lichtverhältnisse, Konkurrenz, Feinde, Brutplätze</w:t>
+      </w:r>
+    </w:p>
+    <w:p>
+      <w:pPr>
+        <w:rPr>
+          <w:rFonts w:ascii="Roboto" w:hAnsi="Roboto"/>
+          <w:b/>
+          <w:bCs/>
+          <w:sz w:val="28"/>
+          <w:szCs w:val="28"/>
+          <w:lang w:val="de-DE"/>
+        </w:rPr>
+      </w:pPr>
+    </w:p>
+    <w:p>
+      <w:pPr>
+        <w:pStyle w:val="Unterthema"/>
+      </w:pPr>
+      <w:r>
+        <w:t>Realnische</w:t>
+      </w:r>
+      <w:r>
+        <w:t xml:space="preserve"> und </w:t>
+      </w:r>
+      <w:r>
+        <w:t>Fundamentalnische</w:t>
+      </w:r>
+    </w:p>
+    <w:p>
+      <w:pPr>
+        <w:rPr>
+          <w:rFonts w:ascii="Roboto" w:hAnsi="Roboto"/>
+          <w:sz w:val="28"/>
+          <w:szCs w:val="28"/>
+          <w:lang w:val="de-DE"/>
+        </w:rPr>
+      </w:pPr>
+      <w:r>
+        <w:rPr>
+          <w:rFonts w:ascii="Roboto" w:hAnsi="Roboto"/>
+          <w:sz w:val="28"/>
+          <w:szCs w:val="28"/>
+          <w:lang w:val="de-DE"/>
+        </w:rPr>
+        <w:t>Man unterscheidet zwischen Realnische und Fundamentalnische:</w:t>
+      </w:r>
+    </w:p>
+    <w:p>
+      <w:pPr>
+        <w:rPr>
+          <w:rFonts w:ascii="Roboto" w:hAnsi="Roboto"/>
+          <w:sz w:val="28"/>
+          <w:szCs w:val="28"/>
+          <w:lang w:val="de-DE"/>
+        </w:rPr>
+      </w:pPr>
+      <w:r>
+        <w:rPr>
+          <w:rFonts w:ascii="Roboto" w:hAnsi="Roboto"/>
+          <w:sz w:val="28"/>
+          <w:szCs w:val="28"/>
+          <w:lang w:val="de-DE"/>
+        </w:rPr>
+        <w:t xml:space="preserve">Die Fundamentalnische ist </w:t>
+      </w:r>
+      <w:r>
+        <w:rPr>
+          <w:rFonts w:ascii="Roboto" w:hAnsi="Roboto"/>
+          <w:sz w:val="28"/>
+          <w:szCs w:val="28"/>
+          <w:lang w:val="de-DE"/>
+        </w:rPr>
+        <w:t>theoretisch mögliche Lebensraum einer Art.</w:t>
+      </w:r>
+      <w:r>
+        <w:t xml:space="preserve"> </w:t>
+      </w:r>
+      <w:r>
+        <w:rPr>
+          <w:rFonts w:ascii="Roboto" w:hAnsi="Roboto"/>
+          <w:sz w:val="28"/>
+          <w:szCs w:val="28"/>
+          <w:lang w:val="de-DE"/>
+        </w:rPr>
+        <w:t>Sie beschreibt alle Bedingungen, unter denen eine Art leben könnte, ohne Konkurrenz oder Feinde.</w:t>
+      </w:r>
+      <w:r>
+        <w:rPr>
+          <w:rFonts w:ascii="Roboto" w:hAnsi="Roboto"/>
+          <w:sz w:val="28"/>
+          <w:szCs w:val="28"/>
+          <w:lang w:val="de-DE"/>
+        </w:rPr>
+        <w:t xml:space="preserve"> (physiologische Potenz)</w:t>
+      </w:r>
+    </w:p>
+    <w:p>
+      <w:pPr>
+        <w:rPr>
+          <w:rFonts w:ascii="Roboto" w:hAnsi="Roboto"/>
+          <w:sz w:val="28"/>
+          <w:szCs w:val="28"/>
+          <w:lang w:val="de-DE"/>
+        </w:rPr>
+      </w:pPr>
+      <w:r>
+        <w:rPr>
+          <w:rFonts w:ascii="Roboto" w:hAnsi="Roboto"/>
+          <w:sz w:val="28"/>
+          <w:szCs w:val="28"/>
+          <w:lang w:val="de-DE"/>
+        </w:rPr>
+        <w:t>Die Realnische ist der tatsächlich genutzte Lebensraum einer Art in der Natur.</w:t>
+      </w:r>
+      <w:r>
+        <w:rPr>
+          <w:rFonts w:ascii="Roboto" w:hAnsi="Roboto"/>
+          <w:sz w:val="28"/>
+          <w:szCs w:val="28"/>
+          <w:lang w:val="de-DE"/>
+        </w:rPr>
+        <w:t xml:space="preserve"> Dabei wird auch der Konkurrenz und Feinde betrachtet. </w:t>
+      </w:r>
+      <w:r>
+        <w:rPr>
+          <w:rFonts w:ascii="Roboto" w:hAnsi="Roboto"/>
+          <w:sz w:val="28"/>
+          <w:szCs w:val="28"/>
+          <w:lang w:val="de-DE"/>
+        </w:rPr>
+        <w:t>Sie ist meist kleiner als die Fundamentalnische.</w:t>
+      </w:r>
+      <w:r>
+        <w:rPr>
+          <w:rFonts w:ascii="Roboto" w:hAnsi="Roboto"/>
+          <w:sz w:val="28"/>
+          <w:szCs w:val="28"/>
+          <w:lang w:val="de-DE"/>
+        </w:rPr>
+        <w:t xml:space="preserve"> (ökologische Potenz)</w:t>
+      </w:r>
+    </w:p>
+    <w:p>
+      <w:pPr>
+        <w:rPr>
+          <w:rFonts w:ascii="Roboto" w:hAnsi="Roboto"/>
+          <w:sz w:val="24"/>
+          <w:szCs w:val="24"/>
+          <w:lang w:val="de-DE"/>
+        </w:rPr>
+      </w:pPr>
+    </w:p>
+    <w:p>
+      <w:pPr>
+        <w:rPr>
+          <w:rFonts w:ascii="Roboto" w:hAnsi="Roboto"/>
+          <w:sz w:val="24"/>
+          <w:szCs w:val="24"/>
+          <w:lang w:val="de-DE"/>
+        </w:rPr>
+      </w:pPr>
+    </w:p>
+    <w:p>
+      <w:pPr>
+        <w:rPr>
+          <w:rFonts w:ascii="Roboto" w:hAnsi="Roboto"/>
+          <w:sz w:val="24"/>
+          <w:szCs w:val="24"/>
+          <w:lang w:val="de-DE"/>
+        </w:rPr>
+      </w:pPr>
+    </w:p>
+    <w:p>
+      <w:pPr>
+        <w:rPr>
+          <w:rFonts w:ascii="Roboto" w:hAnsi="Roboto"/>
+          <w:sz w:val="24"/>
+          <w:szCs w:val="24"/>
+          <w:lang w:val="de-DE"/>
+        </w:rPr>
+      </w:pPr>
+    </w:p>
+    <w:p>
+      <w:pPr>
+        <w:rPr>
+          <w:rFonts w:ascii="Roboto" w:hAnsi="Roboto"/>
+          <w:sz w:val="24"/>
+          <w:szCs w:val="24"/>
+          <w:lang w:val="de-DE"/>
+        </w:rPr>
+      </w:pPr>
+    </w:p>
+    <w:p>
+      <w:pPr>
+        <w:rPr>
+          <w:rFonts w:ascii="Roboto" w:hAnsi="Roboto"/>
+          <w:sz w:val="24"/>
+          <w:szCs w:val="24"/>
+          <w:lang w:val="de-DE"/>
+        </w:rPr>
+      </w:pPr>
+    </w:p>
+    <w:p>
+      <w:pPr>
+        <w:rPr>
+          <w:rFonts w:ascii="Roboto" w:hAnsi="Roboto"/>
+          <w:sz w:val="24"/>
+          <w:szCs w:val="24"/>
+          <w:lang w:val="de-DE"/>
+        </w:rPr>
+      </w:pPr>
+    </w:p>
+    <w:p>
+      <w:pPr>
+        <w:rPr>
+          <w:rFonts w:ascii="Roboto" w:hAnsi="Roboto"/>
+          <w:sz w:val="24"/>
+          <w:szCs w:val="24"/>
+          <w:lang w:val="de-DE"/>
+        </w:rPr>
+      </w:pPr>
+    </w:p>
+    <w:p>
+      <w:pPr>
+        <w:rPr>
+          <w:rFonts w:ascii="Roboto" w:hAnsi="Roboto"/>
+          <w:sz w:val="24"/>
+          <w:szCs w:val="24"/>
+          <w:lang w:val="de-DE"/>
+        </w:rPr>
+      </w:pPr>
+    </w:p>
+    <w:p>
+      <w:pPr>
+        <w:rPr>
+          <w:rFonts w:ascii="Roboto" w:hAnsi="Roboto"/>
+          <w:sz w:val="24"/>
+          <w:szCs w:val="24"/>
+          <w:lang w:val="de-DE"/>
+        </w:rPr>
+      </w:pPr>
+    </w:p>
+    <w:p>
+      <w:pPr>
+        <w:rPr>
+          <w:rFonts w:ascii="Roboto" w:hAnsi="Roboto"/>
+          <w:sz w:val="24"/>
+          <w:szCs w:val="24"/>
+          <w:lang w:val="de-DE"/>
+        </w:rPr>
+      </w:pPr>
+    </w:p>
+    <w:p>
+      <w:pPr>
+        <w:rPr>
+          <w:rFonts w:ascii="Roboto" w:hAnsi="Roboto"/>
+          <w:sz w:val="24"/>
+          <w:szCs w:val="24"/>
+          <w:lang w:val="de-DE"/>
+        </w:rPr>
+      </w:pPr>
+    </w:p>
+    <w:p>
+      <w:pPr>
+        <w:pStyle w:val="Unterthema"/>
+      </w:pPr>
+      <w:r>
+        <w:lastRenderedPageBreak/>
+        <w:t>Nischendiagramm</w:t>
+      </w:r>
+    </w:p>
+    <w:p>
+      <w:pPr>
+        <w:rPr>
+          <w:rFonts w:ascii="Roboto" w:hAnsi="Roboto"/>
+          <w:sz w:val="28"/>
+          <w:szCs w:val="28"/>
+          <w:lang w:val="de-DE"/>
+        </w:rPr>
+      </w:pPr>
+      <w:r>
+        <w:rPr>
+          <w:rFonts w:ascii="Roboto" w:hAnsi="Roboto"/>
+          <w:sz w:val="28"/>
+          <w:szCs w:val="28"/>
+          <w:lang w:val="de-DE"/>
+        </w:rPr>
+        <w:t>Je mehr Faktoren betrachtet werden, desto mehrdimensional wird die Nische.</w:t>
+      </w:r>
+      <w:r>
+        <w:rPr>
+          <w:rFonts w:ascii="Roboto" w:hAnsi="Roboto"/>
+          <w:sz w:val="28"/>
+          <w:szCs w:val="28"/>
+          <w:lang w:val="de-DE"/>
+        </w:rPr>
+        <w:t xml:space="preserve"> Man kann</w:t>
+      </w:r>
+      <w:r>
+        <w:rPr>
+          <w:rFonts w:ascii="Roboto" w:hAnsi="Roboto"/>
+          <w:sz w:val="28"/>
+          <w:szCs w:val="28"/>
+          <w:lang w:val="de-DE"/>
+        </w:rPr>
+        <w:t xml:space="preserve"> mehrere (2-3) Nischendimensionen in einem </w:t>
+      </w:r>
+      <w:r>
+        <w:rPr>
+          <w:rFonts w:ascii="Roboto" w:hAnsi="Roboto"/>
+          <w:sz w:val="28"/>
+          <w:szCs w:val="28"/>
+          <w:lang w:val="de-DE"/>
+        </w:rPr>
+        <w:t>(2</w:t>
+      </w:r>
+      <w:r>
+        <w:rPr>
+          <w:rFonts w:ascii="Roboto" w:hAnsi="Roboto"/>
+          <w:sz w:val="28"/>
+          <w:szCs w:val="28"/>
+          <w:lang w:val="de-DE"/>
+        </w:rPr>
+        <w:t>-</w:t>
+      </w:r>
+      <w:r>
+        <w:rPr>
+          <w:rFonts w:ascii="Roboto" w:hAnsi="Roboto"/>
+          <w:sz w:val="28"/>
+          <w:szCs w:val="28"/>
+          <w:lang w:val="de-DE"/>
+        </w:rPr>
+        <w:t xml:space="preserve"> oder </w:t>
+      </w:r>
+      <w:r>
+        <w:rPr>
+          <w:rFonts w:ascii="Roboto" w:hAnsi="Roboto"/>
+          <w:sz w:val="28"/>
+          <w:szCs w:val="28"/>
+          <w:lang w:val="de-DE"/>
+        </w:rPr>
+        <w:t>3-dimensionalen</w:t>
+      </w:r>
+      <w:r>
+        <w:rPr>
+          <w:rFonts w:ascii="Roboto" w:hAnsi="Roboto"/>
+          <w:sz w:val="28"/>
+          <w:szCs w:val="28"/>
+          <w:lang w:val="de-DE"/>
+        </w:rPr>
+        <w:t xml:space="preserve">) </w:t>
+      </w:r>
+      <w:r>
+        <w:rPr>
+          <w:rFonts w:ascii="Roboto" w:hAnsi="Roboto"/>
+          <w:sz w:val="28"/>
+          <w:szCs w:val="28"/>
+          <w:lang w:val="de-DE"/>
+        </w:rPr>
+        <w:t>Nischendiagramm darstellen:</w:t>
+      </w:r>
+    </w:p>
+    <w:p>
+      <w:pPr>
+        <w:jc w:val="center"/>
+        <w:rPr>
+          <w:rFonts w:ascii="Roboto" w:hAnsi="Roboto"/>
+          <w:b/>
+          <w:bCs/>
+          <w:sz w:val="28"/>
+          <w:szCs w:val="28"/>
+          <w:lang w:val="de-DE"/>
+        </w:rPr>
+      </w:pPr>
+      <w:r>
+        <w:rPr>
+          <w:noProof/>
+        </w:rPr>
+        <w:drawing>
+          <wp:inline distT="0" distB="0" distL="0" distR="0" wp14:anchorId="438D151E" wp14:editId="3BB27194">
+            <wp:extent cx="4026373" cy="2907052"/>
+            <wp:effectExtent l="76200" t="76200" r="127000" b="140970"/>
+            <wp:docPr id="2092151389" name="Resim 1" descr="Ökologische Nische"/>
+            <wp:cNvGraphicFramePr>
+              <a:graphicFrameLocks xmlns:a="http://schemas.openxmlformats.org/drawingml/2006/main" noChangeAspect="1"/>
+            </wp:cNvGraphicFramePr>
+            <a:graphic xmlns:a="http://schemas.openxmlformats.org/drawingml/2006/main">
+              <a:graphicData uri="http://schemas.openxmlformats.org/drawingml/2006/picture">
+                <pic:pic xmlns:pic="http://schemas.openxmlformats.org/drawingml/2006/picture">
+                  <pic:nvPicPr>
+                    <pic:cNvPr id="0" name="Picture 1" descr="Ökologische Nische"/>
+                    <pic:cNvPicPr>
+                      <a:picLocks noChangeAspect="1" noChangeArrowheads="1"/>
+                    </pic:cNvPicPr>
+                  </pic:nvPicPr>
+                  <pic:blipFill>
+                    <a:blip r:embed="rId10">
+                      <a:extLst>
+                        <a:ext uri="{28A0092B-C50C-407E-A947-70E740481C1C}">
+                          <a14:useLocalDpi xmlns:a14="http://schemas.microsoft.com/office/drawing/2010/main" val="0"/>
+                        </a:ext>
+                      </a:extLst>
+                    </a:blip>
+                    <a:srcRect/>
+                    <a:stretch>
+                      <a:fillRect/>
+                    </a:stretch>
+                  </pic:blipFill>
+                  <pic:spPr bwMode="auto">
+                    <a:xfrm>
+                      <a:off x="0" y="0"/>
+                      <a:ext cx="4122804" cy="2976676"/>
+                    </a:xfrm>
+                    <a:prstGeom prst="rect">
+                      <a:avLst/>
+                    </a:prstGeom>
+                    <a:ln w="38100" cap="sq">
+                      <a:solidFill>
+                        <a:srgbClr val="000000"/>
+                      </a:solidFill>
+                      <a:prstDash val="solid"/>
+                      <a:miter lim="800000"/>
+                    </a:ln>
+                    <a:effectLst>
+                      <a:outerShdw blurRad="50800" dist="38100" dir="2700000" algn="tl" rotWithShape="0">
+                        <a:srgbClr val="000000">
+                          <a:alpha val="43000"/>
+                        </a:srgbClr>
+                      </a:outerShdw>
+                    </a:effectLst>
+                  </pic:spPr>
+                </pic:pic>
+              </a:graphicData>
+            </a:graphic>
+          </wp:inline>
+        </w:drawing>
+      </w:r>
+    </w:p>
+    <w:p>
+      <w:pPr>
+        <w:rPr>
+          <w:rFonts w:ascii="Roboto" w:hAnsi="Roboto"/>
+          <w:sz w:val="28"/>
+          <w:szCs w:val="28"/>
+          <w:lang w:val="de-DE"/>
+        </w:rPr>
+      </w:pPr>
+      <w:r>
+        <w:rPr>
+          <w:rFonts w:ascii="Roboto" w:hAnsi="Roboto"/>
+          <w:sz w:val="28"/>
+          <w:szCs w:val="28"/>
+          <w:lang w:val="de-DE"/>
+        </w:rPr>
+        <w:t xml:space="preserve">Wenn zwei Arten ähnliche Nischen nutzen: </w:t>
+      </w:r>
+    </w:p>
+    <w:p>
+      <w:pPr>
+        <w:rPr>
+          <w:rFonts w:ascii="Roboto" w:hAnsi="Roboto"/>
+          <w:sz w:val="28"/>
+          <w:szCs w:val="28"/>
+          <w:lang w:val="de-DE"/>
+        </w:rPr>
+      </w:pPr>
+      <w:r>
+        <w:rPr>
+          <w:rFonts w:ascii="Roboto" w:hAnsi="Roboto"/>
+          <w:sz w:val="28"/>
+          <w:szCs w:val="28"/>
+          <w:lang w:val="de-DE"/>
+        </w:rPr>
+        <w:t>-</w:t>
+      </w:r>
+      <w:r>
+        <w:rPr>
+          <w:rFonts w:ascii="Roboto" w:hAnsi="Roboto"/>
+          <w:sz w:val="28"/>
+          <w:szCs w:val="28"/>
+          <w:lang w:val="de-DE"/>
+        </w:rPr>
+        <w:t xml:space="preserve">entsteht Konkurrenz </w:t>
+      </w:r>
+    </w:p>
+    <w:p>
+      <w:pPr>
+        <w:rPr>
+          <w:rFonts w:ascii="Roboto" w:hAnsi="Roboto"/>
+          <w:sz w:val="28"/>
+          <w:szCs w:val="28"/>
+          <w:lang w:val="de-DE"/>
+        </w:rPr>
+      </w:pPr>
+      <w:r>
+        <w:rPr>
+          <w:rFonts w:ascii="Roboto" w:hAnsi="Roboto"/>
+          <w:sz w:val="28"/>
+          <w:szCs w:val="28"/>
+          <w:lang w:val="de-DE"/>
+        </w:rPr>
+        <w:t>-</w:t>
+      </w:r>
+      <w:r>
+        <w:rPr>
+          <w:rFonts w:ascii="Roboto" w:hAnsi="Roboto"/>
+          <w:sz w:val="28"/>
+          <w:szCs w:val="28"/>
+          <w:lang w:val="de-DE"/>
+        </w:rPr>
+        <w:t>die Realnischen verschieben sich</w:t>
+      </w:r>
+    </w:p>
+    <w:p>
+      <w:pPr>
+        <w:rPr>
+          <w:rFonts w:ascii="Roboto" w:hAnsi="Roboto"/>
+          <w:sz w:val="28"/>
+          <w:szCs w:val="28"/>
+          <w:lang w:val="de-DE"/>
+        </w:rPr>
+      </w:pPr>
+      <w:r>
+        <w:rPr>
+          <w:rFonts w:ascii="Roboto" w:hAnsi="Roboto"/>
+          <w:sz w:val="28"/>
+          <w:szCs w:val="28"/>
+          <w:lang w:val="de-DE"/>
+        </w:rPr>
+        <w:t>-Nischentrennung:</w:t>
+      </w:r>
+    </w:p>
+    <w:p>
+      <w:pPr>
+        <w:ind w:left="705"/>
+        <w:rPr>
+          <w:rFonts w:ascii="Roboto" w:hAnsi="Roboto"/>
+          <w:sz w:val="28"/>
+          <w:szCs w:val="28"/>
+          <w:lang w:val="de-DE"/>
+        </w:rPr>
+      </w:pPr>
+      <w:r>
+        <w:rPr>
+          <w:rFonts w:ascii="Roboto" w:hAnsi="Roboto"/>
+          <w:sz w:val="28"/>
+          <w:szCs w:val="28"/>
+          <w:lang w:val="de-DE"/>
+        </w:rPr>
+        <w:sym w:font="Wingdings" w:char="F0E0"/>
+      </w:r>
+      <w:r>
+        <w:rPr>
+          <w:rFonts w:ascii="Roboto" w:hAnsi="Roboto"/>
+          <w:sz w:val="28"/>
+          <w:szCs w:val="28"/>
+          <w:lang w:val="de-DE"/>
+        </w:rPr>
+        <w:t xml:space="preserve"> </w:t>
+      </w:r>
+      <w:r>
+        <w:rPr>
+          <w:rFonts w:ascii="Roboto" w:hAnsi="Roboto"/>
+          <w:sz w:val="28"/>
+          <w:szCs w:val="28"/>
+          <w:lang w:val="de-DE"/>
+        </w:rPr>
+        <w:t>Arten teilen Ressourcen auf, um Konkurrenz zu vermeiden.</w:t>
+      </w:r>
+      <w:r>
+        <w:rPr>
+          <w:rFonts w:ascii="Roboto" w:hAnsi="Roboto"/>
+          <w:sz w:val="28"/>
+          <w:szCs w:val="28"/>
+          <w:lang w:val="de-DE"/>
+        </w:rPr>
+        <w:t xml:space="preserve"> </w:t>
+      </w:r>
+      <w:r>
+        <w:rPr>
+          <w:rFonts w:ascii="Roboto" w:hAnsi="Roboto"/>
+          <w:i/>
+          <w:iCs/>
+          <w:sz w:val="24"/>
+          <w:szCs w:val="24"/>
+          <w:lang w:val="de-DE"/>
+        </w:rPr>
+        <w:t>(Unterschiedliche Jagdzeiten, Beute und Lebensräume im gleichen Gebiet)</w:t>
+      </w:r>
+    </w:p>
+    <w:p>
+      <w:pPr>
+        <w:pStyle w:val="Unterthema"/>
+        <w:rPr>
           <w:color w:val="FF0000"/>
         </w:rPr>
       </w:pPr>
@@ -3813,6 +4702,7 @@
         <w:pStyle w:val="Thema"/>
       </w:pPr>
       <w:r>
+        <w:lastRenderedPageBreak/>
         <w:t>Temperaturregulationsmechanismen von Tieren</w:t>
       </w:r>
     </w:p>
@@ -4087,7 +4977,6 @@
                 <w:sz w:val="24"/>
                 <w:szCs w:val="24"/>
               </w:rPr>
-              <w:lastRenderedPageBreak/>
               <w:t>-Isolation durch:</w:t>
             </w:r>
           </w:p>
@@ -4234,7 +5123,6 @@
                 <w:sz w:val="24"/>
                 <w:szCs w:val="24"/>
               </w:rPr>
-              <w:lastRenderedPageBreak/>
               <w:t>-Fische, Amphibien, Reptilien, Wirbellose</w:t>
             </w:r>
           </w:p>
@@ -4365,7 +5253,6 @@
                 <w:sz w:val="24"/>
                 <w:szCs w:val="24"/>
               </w:rPr>
-              <w:lastRenderedPageBreak/>
               <w:t>-kaum/keine Isolation</w:t>
             </w:r>
           </w:p>
@@ -4393,7 +5280,6 @@
                 <w:sz w:val="24"/>
                 <w:szCs w:val="24"/>
               </w:rPr>
-              <w:lastRenderedPageBreak/>
               <w:t>Vorteile:</w:t>
             </w:r>
           </w:p>
@@ -6326,7 +7212,6 @@
         <w:pStyle w:val="Thema"/>
       </w:pPr>
       <w:r>
-        <w:lastRenderedPageBreak/>
         <w:t>Minimumsregel / Optimumregel</w:t>
       </w:r>
     </w:p>
@@ -7315,6 +8200,7 @@
         <w:rPr>
           <w:noProof/>
         </w:rPr>
+        <w:lastRenderedPageBreak/>
         <w:drawing>
           <wp:inline distT="0" distB="0" distL="0" distR="0" wp14:anchorId="259930E5" wp14:editId="130D3EDC">
             <wp:extent cx="4418101" cy="2484208"/>
@@ -7333,7 +8219,7 @@
                     </pic:cNvPicPr>
                   </pic:nvPicPr>
                   <pic:blipFill>
-                    <a:blip r:embed="rId10">
+                    <a:blip r:embed="rId11">
                       <a:extLst>
                         <a:ext uri="{28A0092B-C50C-407E-A947-70E740481C1C}">
                           <a14:useLocalDpi xmlns:a14="http://schemas.microsoft.com/office/drawing/2010/main" val="0"/>
@@ -8199,6 +9085,7 @@
         <w:rPr>
           <w:noProof/>
         </w:rPr>
+        <w:lastRenderedPageBreak/>
         <w:drawing>
           <wp:inline distT="0" distB="0" distL="0" distR="0" wp14:anchorId="298995C0" wp14:editId="1BCCBB1B">
             <wp:extent cx="4138703" cy="2327564"/>
@@ -8217,7 +9104,7 @@
                     </pic:cNvPicPr>
                   </pic:nvPicPr>
                   <pic:blipFill>
-                    <a:blip r:embed="rId11" cstate="print">
+                    <a:blip r:embed="rId12" cstate="print">
                       <a:extLst>
                         <a:ext uri="{28A0092B-C50C-407E-A947-70E740481C1C}">
                           <a14:useLocalDpi xmlns:a14="http://schemas.microsoft.com/office/drawing/2010/main" val="0"/>
@@ -8637,6 +9524,7 @@
         <w:pStyle w:val="Thema"/>
       </w:pPr>
       <w:r>
+        <w:lastRenderedPageBreak/>
         <w:t>Wechselbeziehungen zwischen Lebewesen</w:t>
       </w:r>
     </w:p>
@@ -8668,7 +9556,7 @@
             <wp:cNvGraphicFramePr/>
             <a:graphic xmlns:a="http://schemas.openxmlformats.org/drawingml/2006/main">
               <a:graphicData uri="http://schemas.openxmlformats.org/drawingml/2006/diagram">
-                <dgm:relIds xmlns:dgm="http://schemas.openxmlformats.org/drawingml/2006/diagram" xmlns:r="http://schemas.openxmlformats.org/officeDocument/2006/relationships" r:dm="rId12" r:lo="rId13" r:qs="rId14" r:cs="rId15"/>
+                <dgm:relIds xmlns:dgm="http://schemas.openxmlformats.org/drawingml/2006/diagram" xmlns:r="http://schemas.openxmlformats.org/officeDocument/2006/relationships" r:dm="rId13" r:lo="rId14" r:qs="rId15" r:cs="rId16"/>
               </a:graphicData>
             </a:graphic>
           </wp:inline>
@@ -8693,7 +9581,6 @@
           <w:sz w:val="24"/>
           <w:szCs w:val="24"/>
         </w:rPr>
-        <w:lastRenderedPageBreak/>
         <w:t xml:space="preserve">interspezifische </w:t>
       </w:r>
       <w:r>
@@ -8789,17 +9676,7 @@
           <w:sz w:val="24"/>
           <w:szCs w:val="24"/>
         </w:rPr>
-        <w:t>Beziehungen</w:t>
-      </w:r>
-      <w:r>
-        <w:rPr>
-          <w:b w:val="0"/>
-          <w:bCs w:val="0"/>
-          <w:color w:val="auto"/>
-          <w:sz w:val="24"/>
-          <w:szCs w:val="24"/>
-        </w:rPr>
-        <w:t xml:space="preserve"> </w:t>
+        <w:t xml:space="preserve">Beziehungen </w:t>
       </w:r>
       <w:r>
         <w:rPr>
@@ -8966,17 +9843,7 @@
           <w:sz w:val="24"/>
           <w:szCs w:val="24"/>
         </w:rPr>
-        <w:t xml:space="preserve"> </w:t>
-      </w:r>
-      <w:r>
-        <w:rPr>
-          <w:b w:val="0"/>
-          <w:bCs w:val="0"/>
-          <w:color w:val="70AD47" w:themeColor="accent6"/>
-          <w:sz w:val="24"/>
-          <w:szCs w:val="24"/>
-        </w:rPr>
-        <w:t xml:space="preserve"> </w:t>
+        <w:t xml:space="preserve">  </w:t>
       </w:r>
       <w:r>
         <w:rPr>
@@ -9070,55 +9937,7 @@
           <w:sz w:val="22"/>
           <w:szCs w:val="22"/>
         </w:rPr>
-        <w:t xml:space="preserve">(z. B. Konkurrenz, Symbiose, </w:t>
-      </w:r>
-      <w:r>
-        <w:rPr>
-          <w:b w:val="0"/>
-          <w:bCs w:val="0"/>
-          <w:i/>
-          <w:iCs/>
-          <w:color w:val="auto"/>
-          <w:sz w:val="22"/>
-          <w:szCs w:val="22"/>
-        </w:rPr>
-        <w:t>F</w:t>
-      </w:r>
-      <w:r>
-        <w:rPr>
-          <w:b w:val="0"/>
-          <w:bCs w:val="0"/>
-          <w:i/>
-          <w:iCs/>
-          <w:color w:val="auto"/>
-          <w:sz w:val="22"/>
-          <w:szCs w:val="22"/>
-        </w:rPr>
-        <w:t>r</w:t>
-      </w:r>
-      <w:r>
-        <w:rPr>
-          <w:b w:val="0"/>
-          <w:bCs w:val="0"/>
-          <w:i/>
-          <w:iCs/>
-          <w:color w:val="auto"/>
-          <w:sz w:val="22"/>
-          <w:szCs w:val="22"/>
-        </w:rPr>
-        <w:t>essfeind</w:t>
-      </w:r>
-      <w:r>
-        <w:rPr>
-          <w:b w:val="0"/>
-          <w:bCs w:val="0"/>
-          <w:i/>
-          <w:iCs/>
-          <w:color w:val="auto"/>
-          <w:sz w:val="22"/>
-          <w:szCs w:val="22"/>
-        </w:rPr>
-        <w:t>-Beute-Beziehungen).</w:t>
+        <w:t>(z. B. Konkurrenz, Symbiose, Fressfeind-Beute-Beziehungen).</w:t>
       </w:r>
     </w:p>
     <w:p>
@@ -9498,15 +10317,7 @@
           <w:sz w:val="24"/>
           <w:szCs w:val="24"/>
         </w:rPr>
-        <w:t>Koexistenz</w:t>
-      </w:r>
-      <w:r>
-        <w:rPr>
-          <w:color w:val="806000" w:themeColor="accent4" w:themeShade="80"/>
-          <w:sz w:val="24"/>
-          <w:szCs w:val="24"/>
-        </w:rPr>
-        <w:t>:</w:t>
+        <w:t>Koexistenz:</w:t>
       </w:r>
       <w:r>
         <w:rPr>
@@ -9672,19 +10483,7 @@
           <w:sz w:val="18"/>
           <w:szCs w:val="18"/>
         </w:rPr>
-        <w:t xml:space="preserve">Beispiel: </w:t>
-      </w:r>
-      <w:r>
-        <w:rPr>
-          <w:b w:val="0"/>
-          <w:bCs w:val="0"/>
-          <w:i/>
-          <w:iCs/>
-          <w:color w:val="auto"/>
-          <w:sz w:val="18"/>
-          <w:szCs w:val="18"/>
-        </w:rPr>
-        <w:t xml:space="preserve">Zwei Vogelarten im selben Wald: </w:t>
+        <w:t xml:space="preserve">Beispiel: Zwei Vogelarten im selben Wald: </w:t>
       </w:r>
       <w:r>
         <w:rPr>
@@ -10028,15 +10827,7 @@
           <w:sz w:val="24"/>
           <w:szCs w:val="24"/>
         </w:rPr>
-        <w:t>Symbiose</w:t>
-      </w:r>
-      <w:r>
-        <w:rPr>
-          <w:color w:val="5B9BD5" w:themeColor="accent5"/>
-          <w:sz w:val="24"/>
-          <w:szCs w:val="24"/>
-        </w:rPr>
-        <w:t>:</w:t>
+        <w:t>Symbiose:</w:t>
       </w:r>
       <w:r>
         <w:rPr>
@@ -10488,15 +11279,7 @@
           <w:sz w:val="24"/>
           <w:szCs w:val="24"/>
         </w:rPr>
-        <w:t>Prädation</w:t>
-      </w:r>
-      <w:r>
-        <w:rPr>
-          <w:color w:val="7030A0"/>
-          <w:sz w:val="24"/>
-          <w:szCs w:val="24"/>
-        </w:rPr>
-        <w:t>:</w:t>
+        <w:t>Prädation:</w:t>
       </w:r>
       <w:r>
         <w:rPr>
@@ -11292,11 +12075,24 @@
         <w:rPr>
           <w:b w:val="0"/>
           <w:bCs w:val="0"/>
-          <w:color w:val="auto"/>
+          <w:color w:val="EC00F2"/>
           <w:sz w:val="24"/>
           <w:szCs w:val="24"/>
         </w:rPr>
       </w:pPr>
+      <w:r>
+        <w:rPr>
+          <w:b w:val="0"/>
+          <w:bCs w:val="0"/>
+          <w:i/>
+          <w:iCs/>
+          <w:color w:val="EC00F2"/>
+          <w:sz w:val="22"/>
+          <w:szCs w:val="22"/>
+          <w:highlight w:val="yellow"/>
+        </w:rPr>
+        <w:t>HERBIOVORE UND CARNIVORE MUSS NOCH ERKLÄRT WERDEN!!!!!!!</w:t>
+      </w:r>
     </w:p>
     <w:p>
       <w:pPr>
@@ -14581,7 +15377,7 @@
   <dgm:whole/>
   <dgm:extLst>
     <a:ext uri="http://schemas.microsoft.com/office/drawing/2008/diagram">
-      <dsp:dataModelExt xmlns:dsp="http://schemas.microsoft.com/office/drawing/2008/diagram" relId="rId16" minVer="http://schemas.openxmlformats.org/drawingml/2006/diagram"/>
+      <dsp:dataModelExt xmlns:dsp="http://schemas.microsoft.com/office/drawing/2008/diagram" relId="rId17" minVer="http://schemas.openxmlformats.org/drawingml/2006/diagram"/>
     </a:ext>
   </dgm:extLst>
 </dgm:dataModel>

</xml_diff>